<commit_message>
updated agent guide and claude code and codex agent setup
</commit_message>
<xml_diff>
--- a/IMO-Copilot-Studio/CopilotStudio_Agent_BuildGuide-OldExperience.docx
+++ b/IMO-Copilot-Studio/CopilotStudio_Agent_BuildGuide-OldExperience.docx
@@ -381,6 +381,17 @@
       </w:r>
     </w:p>
     <w:p>
+      <w:r>
+        <w:rPr>
+          <w:b/>
+        </w:rPr>
+        <w:t>Note: </w:t>
+      </w:r>
+      <w:r>
+        <w:t xml:space="preserve">To sign in to Microsoft Copilot Studio, you need a work or school Microsoft account. Personal Microsoft accounts (e.g., @outlook.com, @hotmail.com) are not supported.</w:t>
+      </w:r>
+    </w:p>
+    <w:p>
       <w:pPr>
         <w:pStyle w:val="Normal"/>
       </w:pPr>
@@ -1853,147 +1864,422 @@
           </w:p>
         </w:tc>
       </w:tr>
-      <w:tr xmlns:wp14="http://schemas.microsoft.com/office/word/2010/wordml" wp14:textId="77777777">
-        <w:trPr>
-          <w:trHeight w:val="300"/>
-        </w:trPr>
+      <w:tr>
         <w:tc>
           <w:tcPr>
-            <w:tcW w:w="4393" w:type="dxa"/>
-            <w:tcMar/>
+            <w:tcW w:type="dxa" w:w="4393"/>
           </w:tcPr>
-          <w:p wp14:textId="77777777">
+          <w:p>
             <w:r>
-              <w:rPr/>
-              <w:t>ccp___entity_extraction</w:t>
+              <w:rPr>
+                <w:sz w:val="18"/>
+              </w:rPr>
+              <w:t>mcp__imo-health__categorize___categorize_problems</w:t>
             </w:r>
           </w:p>
         </w:tc>
         <w:tc>
           <w:tcPr>
-            <w:tcW w:w="4320" w:type="dxa"/>
-            <w:tcMar/>
+            <w:tcW w:type="dxa" w:w="4320"/>
           </w:tcPr>
-          <w:p wp14:textId="77777777">
+          <w:p>
             <w:r>
-              <w:rPr/>
-              <w:t>Extract diagnosis entities from clinical notes using IMO Entity Extraction API.</w:t>
+              <w:rPr>
+                <w:sz w:val="18"/>
+              </w:rPr>
+              <w:t>Categorize medical problems</w:t>
             </w:r>
           </w:p>
         </w:tc>
       </w:tr>
-      <w:tr xmlns:wp14="http://schemas.microsoft.com/office/word/2010/wordml" wp14:textId="77777777">
-        <w:trPr>
-          <w:trHeight w:val="300"/>
-        </w:trPr>
+      <w:tr>
         <w:tc>
           <w:tcPr>
-            <w:tcW w:w="4393" w:type="dxa"/>
-            <w:tcMar/>
+            <w:tcW w:type="dxa" w:w="4393"/>
           </w:tcPr>
-          <w:p wp14:textId="77777777">
+          <w:p>
             <w:r>
-              <w:rPr/>
-              <w:t>normalize-ppml___normalize_ppml_term</w:t>
+              <w:rPr>
+                <w:sz w:val="18"/>
+              </w:rPr>
+              <w:t>mcp__imo-health__ccp___entity_extraction</w:t>
             </w:r>
           </w:p>
         </w:tc>
         <w:tc>
           <w:tcPr>
-            <w:tcW w:w="4320" w:type="dxa"/>
-            <w:tcMar/>
+            <w:tcW w:type="dxa" w:w="4320"/>
           </w:tcPr>
-          <w:p wp14:textId="77777777">
+          <w:p>
             <w:r>
-              <w:rPr/>
-              <w:t>Normalize medical terms using the IMO Precision Normalize API.</w:t>
+              <w:rPr>
+                <w:sz w:val="18"/>
+              </w:rPr>
+              <w:t>Extract clinical entities from text</w:t>
             </w:r>
           </w:p>
         </w:tc>
       </w:tr>
-      <w:tr xmlns:wp14="http://schemas.microsoft.com/office/word/2010/wordml" wp14:textId="77777777">
-        <w:trPr>
-          <w:trHeight w:val="300"/>
-        </w:trPr>
+      <w:tr>
         <w:tc>
           <w:tcPr>
-            <w:tcW w:w="4393" w:type="dxa"/>
-            <w:tcMar/>
+            <w:tcW w:type="dxa" w:w="4393"/>
           </w:tcPr>
-          <w:p wp14:textId="77777777">
+          <w:p>
             <w:r>
-              <w:rPr/>
-              <w:t>graphql-modifier___get_lexical</w:t>
+              <w:rPr>
+                <w:sz w:val="18"/>
+              </w:rPr>
+              <w:t>mcp__imo-health__core-search___get_term_detail</w:t>
             </w:r>
           </w:p>
         </w:tc>
         <w:tc>
           <w:tcPr>
-            <w:tcW w:w="4320" w:type="dxa"/>
-            <w:tcMar/>
+            <w:tcW w:type="dxa" w:w="4320"/>
           </w:tcPr>
-          <w:p wp14:textId="77777777">
+          <w:p>
             <w:r>
-              <w:rPr/>
-              <w:t>Look up an IMO Problem lexical in the Knowledge Graph by its lexical code.</w:t>
+              <w:rPr>
+                <w:sz w:val="18"/>
+              </w:rPr>
+              <w:t>Get details for a specific term</w:t>
             </w:r>
           </w:p>
         </w:tc>
       </w:tr>
-      <w:tr xmlns:wp14="http://schemas.microsoft.com/office/word/2010/wordml" wp14:textId="77777777">
-        <w:trPr>
-          <w:trHeight w:val="300"/>
-        </w:trPr>
+      <w:tr>
         <w:tc>
           <w:tcPr>
-            <w:tcW w:w="4393" w:type="dxa"/>
-            <w:tcMar/>
+            <w:tcW w:type="dxa" w:w="4393"/>
           </w:tcPr>
-          <w:p wp14:textId="77777777">
+          <w:p>
             <w:r>
-              <w:rPr/>
-              <w:t>graphql-modifier___get_narrower_with_refinements</w:t>
+              <w:rPr>
+                <w:sz w:val="18"/>
+              </w:rPr>
+              <w:t>mcp__imo-health__core-search___lookup_term_by_code</w:t>
             </w:r>
           </w:p>
         </w:tc>
         <w:tc>
           <w:tcPr>
-            <w:tcW w:w="4320" w:type="dxa"/>
-            <w:tcMar/>
+            <w:tcW w:type="dxa" w:w="4320"/>
           </w:tcPr>
-          <w:p wp14:textId="77777777">
+          <w:p>
             <w:r>
-              <w:rPr/>
-              <w:t>Get narrower IMO lexicals filtered by specific refinement criteria.</w:t>
+              <w:rPr>
+                <w:sz w:val="18"/>
+              </w:rPr>
+              <w:t>Look up a term by its code</w:t>
             </w:r>
           </w:p>
         </w:tc>
       </w:tr>
-      <w:tr xmlns:wp14="http://schemas.microsoft.com/office/word/2010/wordml" wp14:textId="77777777">
-        <w:trPr>
-          <w:trHeight w:val="300"/>
-        </w:trPr>
+      <w:tr>
         <w:tc>
           <w:tcPr>
-            <w:tcW w:w="4393" w:type="dxa"/>
-            <w:tcMar/>
+            <w:tcW w:type="dxa" w:w="4393"/>
           </w:tcPr>
-          <w:p wp14:textId="77777777">
+          <w:p>
             <w:r>
-              <w:rPr/>
-              <w:t>graphql-modifier___get_refinement_group</w:t>
+              <w:rPr>
+                <w:sz w:val="18"/>
+              </w:rPr>
+              <w:t>mcp__imo-health__core-search___search_medical_term</w:t>
             </w:r>
           </w:p>
         </w:tc>
         <w:tc>
           <w:tcPr>
-            <w:tcW w:w="4320" w:type="dxa"/>
-            <w:tcMar/>
+            <w:tcW w:type="dxa" w:w="4320"/>
           </w:tcPr>
-          <w:p wp14:textId="77777777">
+          <w:p>
             <w:r>
-              <w:rPr/>
-              <w:t>Look up all refinements within a specific refinement group.</w:t>
+              <w:rPr>
+                <w:sz w:val="18"/>
+              </w:rPr>
+              <w:t>Search for medical terms</w:t>
+            </w:r>
+          </w:p>
+        </w:tc>
+      </w:tr>
+      <w:tr>
+        <w:tc>
+          <w:tcPr>
+            <w:tcW w:type="dxa" w:w="4393"/>
+          </w:tcPr>
+          <w:p>
+            <w:r>
+              <w:rPr>
+                <w:sz w:val="18"/>
+              </w:rPr>
+              <w:t>mcp__imo-health__graphql-modifier___get_allowed_refinements</w:t>
+            </w:r>
+          </w:p>
+        </w:tc>
+        <w:tc>
+          <w:tcPr>
+            <w:tcW w:type="dxa" w:w="4320"/>
+          </w:tcPr>
+          <w:p>
+            <w:r>
+              <w:rPr>
+                <w:sz w:val="18"/>
+              </w:rPr>
+              <w:t>Get allowed refinements for a term</w:t>
+            </w:r>
+          </w:p>
+        </w:tc>
+      </w:tr>
+      <w:tr>
+        <w:tc>
+          <w:tcPr>
+            <w:tcW w:type="dxa" w:w="4393"/>
+          </w:tcPr>
+          <w:p>
+            <w:r>
+              <w:rPr>
+                <w:sz w:val="18"/>
+              </w:rPr>
+              <w:t>mcp__imo-health__graphql-modifier___get_cross_domain</w:t>
+            </w:r>
+          </w:p>
+        </w:tc>
+        <w:tc>
+          <w:tcPr>
+            <w:tcW w:type="dxa" w:w="4320"/>
+          </w:tcPr>
+          <w:p>
+            <w:r>
+              <w:rPr>
+                <w:sz w:val="18"/>
+              </w:rPr>
+              <w:t>Get cross-domain mappings</w:t>
+            </w:r>
+          </w:p>
+        </w:tc>
+      </w:tr>
+      <w:tr>
+        <w:tc>
+          <w:tcPr>
+            <w:tcW w:type="dxa" w:w="4393"/>
+          </w:tcPr>
+          <w:p>
+            <w:r>
+              <w:rPr>
+                <w:sz w:val="18"/>
+              </w:rPr>
+              <w:t>mcp__imo-health__graphql-modifier___get_lexical</w:t>
+            </w:r>
+          </w:p>
+        </w:tc>
+        <w:tc>
+          <w:tcPr>
+            <w:tcW w:type="dxa" w:w="4320"/>
+          </w:tcPr>
+          <w:p>
+            <w:r>
+              <w:rPr>
+                <w:sz w:val="18"/>
+              </w:rPr>
+              <w:t>Get lexical information</w:t>
+            </w:r>
+          </w:p>
+        </w:tc>
+      </w:tr>
+      <w:tr>
+        <w:tc>
+          <w:tcPr>
+            <w:tcW w:type="dxa" w:w="4393"/>
+          </w:tcPr>
+          <w:p>
+            <w:r>
+              <w:rPr>
+                <w:sz w:val="18"/>
+              </w:rPr>
+              <w:t>mcp__imo-health__graphql-modifier___get_mappings</w:t>
+            </w:r>
+          </w:p>
+        </w:tc>
+        <w:tc>
+          <w:tcPr>
+            <w:tcW w:type="dxa" w:w="4320"/>
+          </w:tcPr>
+          <w:p>
+            <w:r>
+              <w:rPr>
+                <w:sz w:val="18"/>
+              </w:rPr>
+              <w:t>Get term mappings</w:t>
+            </w:r>
+          </w:p>
+        </w:tc>
+      </w:tr>
+      <w:tr>
+        <w:tc>
+          <w:tcPr>
+            <w:tcW w:type="dxa" w:w="4393"/>
+          </w:tcPr>
+          <w:p>
+            <w:r>
+              <w:rPr>
+                <w:sz w:val="18"/>
+              </w:rPr>
+              <w:t>mcp__imo-health__graphql-modifier___get_narrower_hierarchy</w:t>
+            </w:r>
+          </w:p>
+        </w:tc>
+        <w:tc>
+          <w:tcPr>
+            <w:tcW w:type="dxa" w:w="4320"/>
+          </w:tcPr>
+          <w:p>
+            <w:r>
+              <w:rPr>
+                <w:sz w:val="18"/>
+              </w:rPr>
+              <w:t>Get narrower hierarchy</w:t>
+            </w:r>
+          </w:p>
+        </w:tc>
+      </w:tr>
+      <w:tr>
+        <w:tc>
+          <w:tcPr>
+            <w:tcW w:type="dxa" w:w="4393"/>
+          </w:tcPr>
+          <w:p>
+            <w:r>
+              <w:rPr>
+                <w:sz w:val="18"/>
+              </w:rPr>
+              <w:t>mcp__imo-health__graphql-modifier___get_narrower_sequential_refinements</w:t>
+            </w:r>
+          </w:p>
+        </w:tc>
+        <w:tc>
+          <w:tcPr>
+            <w:tcW w:type="dxa" w:w="4320"/>
+          </w:tcPr>
+          <w:p>
+            <w:r>
+              <w:rPr>
+                <w:sz w:val="18"/>
+              </w:rPr>
+              <w:t>Get narrower sequential refinements</w:t>
+            </w:r>
+          </w:p>
+        </w:tc>
+      </w:tr>
+      <w:tr>
+        <w:tc>
+          <w:tcPr>
+            <w:tcW w:type="dxa" w:w="4393"/>
+          </w:tcPr>
+          <w:p>
+            <w:r>
+              <w:rPr>
+                <w:sz w:val="18"/>
+              </w:rPr>
+              <w:t>mcp__imo-health__graphql-modifier___get_narrower_with_refinements</w:t>
+            </w:r>
+          </w:p>
+        </w:tc>
+        <w:tc>
+          <w:tcPr>
+            <w:tcW w:type="dxa" w:w="4320"/>
+          </w:tcPr>
+          <w:p>
+            <w:r>
+              <w:rPr>
+                <w:sz w:val="18"/>
+              </w:rPr>
+              <w:t>Get narrower terms with refinements</w:t>
+            </w:r>
+          </w:p>
+        </w:tc>
+      </w:tr>
+      <w:tr>
+        <w:tc>
+          <w:tcPr>
+            <w:tcW w:type="dxa" w:w="4393"/>
+          </w:tcPr>
+          <w:p>
+            <w:r>
+              <w:rPr>
+                <w:sz w:val="18"/>
+              </w:rPr>
+              <w:t>mcp__imo-health__graphql-modifier___get_refinement_group</w:t>
+            </w:r>
+          </w:p>
+        </w:tc>
+        <w:tc>
+          <w:tcPr>
+            <w:tcW w:type="dxa" w:w="4320"/>
+          </w:tcPr>
+          <w:p>
+            <w:r>
+              <w:rPr>
+                <w:sz w:val="18"/>
+              </w:rPr>
+              <w:t>Get refinement groups</w:t>
+            </w:r>
+          </w:p>
+        </w:tc>
+      </w:tr>
+      <w:tr>
+        <w:tc>
+          <w:tcPr>
+            <w:tcW w:type="dxa" w:w="4393"/>
+          </w:tcPr>
+          <w:p>
+            <w:r>
+              <w:rPr>
+                <w:sz w:val="18"/>
+              </w:rPr>
+              <w:t>mcp__imo-health__graphql-modifier___get_related_problems</w:t>
+            </w:r>
+          </w:p>
+        </w:tc>
+        <w:tc>
+          <w:tcPr>
+            <w:tcW w:type="dxa" w:w="4320"/>
+          </w:tcPr>
+          <w:p>
+            <w:r>
+              <w:rPr>
+                <w:sz w:val="18"/>
+              </w:rPr>
+              <w:t>Get related problems</w:t>
+            </w:r>
+          </w:p>
+        </w:tc>
+      </w:tr>
+      <w:tr>
+        <w:tc>
+          <w:tcPr>
+            <w:tcW w:type="dxa" w:w="4393"/>
+          </w:tcPr>
+          <w:p>
+            <w:r>
+              <w:rPr>
+                <w:sz w:val="18"/>
+              </w:rPr>
+              <w:t>mcp__imo-health__normalize-ppml___normalize_ppml_term</w:t>
+            </w:r>
+          </w:p>
+        </w:tc>
+        <w:tc>
+          <w:tcPr>
+            <w:tcW w:type="dxa" w:w="4320"/>
+          </w:tcPr>
+          <w:p>
+            <w:r>
+              <w:rPr>
+                <w:sz w:val="18"/>
+              </w:rPr>
+              <w:t>Normalize a term using PPML</w:t>
             </w:r>
           </w:p>
         </w:tc>

</xml_diff>